<commit_message>
fixed symbols for templates
</commit_message>
<xml_diff>
--- a/backend/data/Kündigung nach TKG 1&1 DSL.docx
+++ b/backend/data/Kündigung nach TKG 1&1 DSL.docx
@@ -1134,13 +1134,11 @@
       <w:pPr>
         <w:rPr>
           <w:rFonts w:ascii="Calibri" w:hAnsi="Calibri" w:cs="Calibri"/>
-          <w:lang w:val="en-US"/>
         </w:rPr>
       </w:pPr>
       <w:r>
         <w:rPr>
           <w:rFonts w:ascii="Calibri" w:hAnsi="Calibri" w:cs="Calibri"/>
-          <w:lang w:val="en-US"/>
         </w:rPr>
         <w:t xml:space="preserve">        {"name":"Handynummer","type":"number","optional":1},</w:t>
       </w:r>
@@ -1154,7 +1152,6 @@
       <w:r>
         <w:rPr>
           <w:rFonts w:ascii="Calibri" w:hAnsi="Calibri" w:cs="Calibri"/>
-          <w:lang w:val="en-US"/>
         </w:rPr>
         <w:t xml:space="preserve">        </w:t>
       </w:r>
@@ -1243,7 +1240,7 @@
         <w:rPr>
           <w:rFonts w:ascii="Calibri" w:hAnsi="Calibri" w:cs="Calibri"/>
         </w:rPr>
-        <w:t>3</w:t>
+        <w:t>4</w:t>
       </w:r>
       <w:r>
         <w:rPr>
@@ -1323,7 +1320,19 @@
         <w:rPr>
           <w:rFonts w:ascii="Calibri" w:hAnsi="Calibri" w:cs="Calibri"/>
         </w:rPr>
-        <w:t>1und1</w:t>
+        <w:t>1</w:t>
+      </w:r>
+      <w:r>
+        <w:rPr>
+          <w:rFonts w:ascii="Calibri" w:hAnsi="Calibri" w:cs="Calibri"/>
+        </w:rPr>
+        <w:t>&amp;</w:t>
+      </w:r>
+      <w:r>
+        <w:rPr>
+          <w:rFonts w:ascii="Calibri" w:hAnsi="Calibri" w:cs="Calibri"/>
+        </w:rPr>
+        <w:t>1</w:t>
       </w:r>
       <w:r>
         <w:rPr>
@@ -1378,7 +1387,19 @@
         <w:rPr>
           <w:rFonts w:ascii="Calibri" w:hAnsi="Calibri" w:cs="Calibri"/>
         </w:rPr>
-        <w:t>1und1</w:t>
+        <w:t>1</w:t>
+      </w:r>
+      <w:r>
+        <w:rPr>
+          <w:rFonts w:ascii="Calibri" w:hAnsi="Calibri" w:cs="Calibri"/>
+        </w:rPr>
+        <w:t>&amp;</w:t>
+      </w:r>
+      <w:r>
+        <w:rPr>
+          <w:rFonts w:ascii="Calibri" w:hAnsi="Calibri" w:cs="Calibri"/>
+        </w:rPr>
+        <w:t>1</w:t>
       </w:r>
       <w:r>
         <w:rPr>

</xml_diff>

<commit_message>
fixed the filter menu
</commit_message>
<xml_diff>
--- a/backend/data/Kündigung nach TKG 1&1 DSL.docx
+++ b/backend/data/Kündigung nach TKG 1&1 DSL.docx
@@ -1289,31 +1289,27 @@
         <w:rPr>
           <w:rFonts w:ascii="Calibri" w:hAnsi="Calibri" w:cs="Calibri"/>
         </w:rPr>
-        <w:t xml:space="preserve">            </w:t>
-      </w:r>
-      <w:r>
-        <w:rPr>
-          <w:rFonts w:ascii="Calibri" w:hAnsi="Calibri" w:cs="Calibri"/>
-        </w:rPr>
-        <w:t>"category":["</w:t>
-      </w:r>
-      <w:r>
-        <w:rPr>
-          <w:rFonts w:ascii="Calibri" w:hAnsi="Calibri" w:cs="Calibri"/>
-        </w:rPr>
-        <w:t>K</w:t>
-      </w:r>
-      <w:r>
-        <w:rPr>
-          <w:rFonts w:ascii="Calibri" w:hAnsi="Calibri" w:cs="Calibri"/>
-        </w:rPr>
-        <w:t>ündigung</w:t>
-      </w:r>
-      <w:r>
-        <w:rPr>
-          <w:rFonts w:ascii="Calibri" w:hAnsi="Calibri" w:cs="Calibri"/>
-        </w:rPr>
-        <w:t>"],</w:t>
+        <w:t xml:space="preserve">            "category":["Kündigung nach TKG"],</w:t>
+      </w:r>
+      <w:r>
+        <w:rPr>
+          <w:rFonts w:ascii="Calibri" w:hAnsi="Calibri" w:cs="Calibri"/>
+        </w:rPr>
+      </w:r>
+      <w:r>
+        <w:rPr>
+          <w:rFonts w:ascii="Calibri" w:hAnsi="Calibri" w:cs="Calibri"/>
+        </w:rPr>
+      </w:r>
+      <w:r>
+        <w:rPr>
+          <w:rFonts w:ascii="Calibri" w:hAnsi="Calibri" w:cs="Calibri"/>
+        </w:rPr>
+      </w:r>
+      <w:r>
+        <w:rPr>
+          <w:rFonts w:ascii="Calibri" w:hAnsi="Calibri" w:cs="Calibri"/>
+        </w:rPr>
       </w:r>
     </w:p>
     <w:p>

</xml_diff>